<commit_message>
Add NB2 notebook and update FUSP activity report
- Add wind_turbine_anomaly_detection_v4.ipynb (regenerated from .py via jupytext)
- Update Relatório de Atividades de Bolsas.docx with professor feedback:
  - Expand all acronyms on first occurrence (LSTM, CNN, SCADA, MLP, etc.)
  - Detail objectives A1-A9 with descriptions
  - Add clickable hyperlinks to all notebooks (NB1-NB5), dataset (Zenodo),
    relatorio_ic.pdf, slides, referencias.bib, notebooks/ and resultados/ dirs
  - Add GitHub repo link prominently in Section 3 and Section 6
</commit_message>
<xml_diff>
--- a/relatorios/Relatório de Atividades de Bolsas.docx
+++ b/relatorios/Relatório de Atividades de Bolsas.docx
@@ -152,23 +152,7 @@
                 <w:sz w:val="18"/>
                 <w:szCs w:val="18"/>
               </w:rPr>
-              <w:t>Av. Afrânio Peixoto, 14 –</w:t>
-            </w:r>
-            <w:r>
-              <w:rPr>
-                <w:rFonts w:ascii="Arial" w:hAnsi="Arial" w:cs="Arial"/>
-                <w:sz w:val="18"/>
-                <w:szCs w:val="18"/>
-              </w:rPr>
-              <w:t xml:space="preserve"> </w:t>
-            </w:r>
-            <w:r>
-              <w:rPr>
-                <w:rFonts w:ascii="Arial" w:hAnsi="Arial" w:cs="Arial"/>
-                <w:sz w:val="18"/>
-                <w:szCs w:val="18"/>
-              </w:rPr>
-              <w:t>Butantã</w:t>
+              <w:t>Av. Afrânio Peixoto, 14 – Butantã</w:t>
             </w:r>
           </w:p>
           <w:p>
@@ -187,63 +171,7 @@
                 <w:sz w:val="18"/>
                 <w:szCs w:val="18"/>
               </w:rPr>
-              <w:t xml:space="preserve">CEP: </w:t>
-            </w:r>
-            <w:r>
-              <w:rPr>
-                <w:rFonts w:ascii="Arial" w:hAnsi="Arial" w:cs="Arial"/>
-                <w:sz w:val="18"/>
-                <w:szCs w:val="18"/>
-              </w:rPr>
-              <w:t>05507-000</w:t>
-            </w:r>
-            <w:r>
-              <w:rPr>
-                <w:rFonts w:ascii="Arial" w:hAnsi="Arial" w:cs="Arial"/>
-                <w:sz w:val="18"/>
-                <w:szCs w:val="18"/>
-              </w:rPr>
-              <w:t xml:space="preserve"> </w:t>
-            </w:r>
-            <w:r>
-              <w:rPr>
-                <w:rFonts w:ascii="Arial" w:hAnsi="Arial" w:cs="Arial"/>
-                <w:sz w:val="18"/>
-                <w:szCs w:val="18"/>
-              </w:rPr>
-              <w:t>–</w:t>
-            </w:r>
-            <w:r>
-              <w:rPr>
-                <w:rFonts w:ascii="Arial" w:hAnsi="Arial" w:cs="Arial"/>
-                <w:sz w:val="18"/>
-                <w:szCs w:val="18"/>
-              </w:rPr>
-              <w:t xml:space="preserve"> </w:t>
-            </w:r>
-            <w:r>
-              <w:rPr>
-                <w:rFonts w:ascii="Arial" w:hAnsi="Arial" w:cs="Arial"/>
-                <w:sz w:val="18"/>
-                <w:szCs w:val="18"/>
-              </w:rPr>
-              <w:t>São Paulo –</w:t>
-            </w:r>
-            <w:r>
-              <w:rPr>
-                <w:rFonts w:ascii="Arial" w:hAnsi="Arial" w:cs="Arial"/>
-                <w:sz w:val="18"/>
-                <w:szCs w:val="18"/>
-              </w:rPr>
-              <w:t xml:space="preserve"> </w:t>
-            </w:r>
-            <w:r>
-              <w:rPr>
-                <w:rFonts w:ascii="Arial" w:hAnsi="Arial" w:cs="Arial"/>
-                <w:sz w:val="18"/>
-                <w:szCs w:val="18"/>
-              </w:rPr>
-              <w:t>SP</w:t>
+              <w:t>CEP: 05507-000 – São Paulo – SP</w:t>
             </w:r>
           </w:p>
           <w:p>
@@ -264,16 +192,7 @@
                 <w:szCs w:val="18"/>
                 <w:lang w:val="en-US"/>
               </w:rPr>
-              <w:t>Tel</w:t>
-            </w:r>
-            <w:r>
-              <w:rPr>
-                <w:rFonts w:ascii="Arial" w:hAnsi="Arial" w:cs="Arial"/>
-                <w:sz w:val="18"/>
-                <w:szCs w:val="18"/>
-                <w:lang w:val="en-US"/>
-              </w:rPr>
-              <w:t>. 55 11 3035-0550</w:t>
+              <w:t>Tel. 55 11 3035-0550</w:t>
             </w:r>
           </w:p>
           <w:p>
@@ -294,16 +213,7 @@
                 <w:szCs w:val="18"/>
                 <w:lang w:val="en-US"/>
               </w:rPr>
-              <w:t xml:space="preserve">Site: </w:t>
-            </w:r>
-            <w:r>
-              <w:rPr>
-                <w:rFonts w:ascii="Arial" w:hAnsi="Arial" w:cs="Arial"/>
-                <w:sz w:val="18"/>
-                <w:szCs w:val="18"/>
-                <w:lang w:val="en-US"/>
-              </w:rPr>
-              <w:t>www.fusp.org.br    email: fusp@fusp.org.br</w:t>
+              <w:t>Site: www.fusp.org.br    email: fusp@fusp.org.br</w:t>
             </w:r>
           </w:p>
           <w:p>
@@ -453,35 +363,7 @@
                 <w:rFonts w:ascii="Arial" w:hAnsi="Arial" w:cs="Arial"/>
                 <w:noProof/>
               </w:rPr>
-              <w:t> </w:t>
-            </w:r>
-            <w:r>
-              <w:rPr>
-                <w:rFonts w:ascii="Arial" w:hAnsi="Arial" w:cs="Arial"/>
-                <w:noProof/>
-              </w:rPr>
-              <w:t> </w:t>
-            </w:r>
-            <w:r>
-              <w:rPr>
-                <w:rFonts w:ascii="Arial" w:hAnsi="Arial" w:cs="Arial"/>
-                <w:noProof/>
-              </w:rPr>
-              <w:t> </w:t>
-            </w:r>
-            <w:r>
-              <w:rPr>
-                <w:rFonts w:ascii="Arial" w:hAnsi="Arial" w:cs="Arial"/>
-                <w:noProof/>
-              </w:rPr>
-              <w:t> </w:t>
-            </w:r>
-            <w:r>
-              <w:rPr>
-                <w:rFonts w:ascii="Arial" w:hAnsi="Arial" w:cs="Arial"/>
-                <w:noProof/>
-              </w:rPr>
-              <w:t> </w:t>
+              <w:t>0</w:t>
             </w:r>
             <w:r>
               <w:rPr>
@@ -586,21 +468,7 @@
                 <w:rFonts w:ascii="Arial" w:hAnsi="Arial" w:cs="Arial"/>
                 <w:b/>
               </w:rPr>
-              <w:t>D</w:t>
-            </w:r>
-            <w:r>
-              <w:rPr>
-                <w:rFonts w:ascii="Arial" w:hAnsi="Arial" w:cs="Arial"/>
-                <w:b/>
-              </w:rPr>
-              <w:t>ata</w:t>
-            </w:r>
-            <w:r>
-              <w:rPr>
-                <w:rFonts w:ascii="Arial" w:hAnsi="Arial" w:cs="Arial"/>
-                <w:b/>
-              </w:rPr>
-              <w:t xml:space="preserve">  </w:t>
+              <w:t xml:space="preserve">Data  </w:t>
             </w:r>
             <w:r>
               <w:rPr>
@@ -713,25 +581,7 @@
                 <w:sz w:val="32"/>
                 <w:szCs w:val="32"/>
               </w:rPr>
-              <w:t>Relatório de Atividades</w:t>
-            </w:r>
-            <w:r>
-              <w:rPr>
-                <w:rFonts w:ascii="Arial" w:hAnsi="Arial" w:cs="Arial"/>
-                <w:b/>
-                <w:sz w:val="32"/>
-                <w:szCs w:val="32"/>
-              </w:rPr>
-              <w:t xml:space="preserve"> de Bols</w:t>
-            </w:r>
-            <w:r>
-              <w:rPr>
-                <w:rFonts w:ascii="Arial" w:hAnsi="Arial" w:cs="Arial"/>
-                <w:b/>
-                <w:sz w:val="32"/>
-                <w:szCs w:val="32"/>
-              </w:rPr>
-              <w:t>as</w:t>
+              <w:t>Relatório de Atividades de Bolsas</w:t>
             </w:r>
           </w:p>
           <w:p>
@@ -825,14 +675,7 @@
                 <w:rFonts w:ascii="Arial" w:hAnsi="Arial" w:cs="Arial"/>
                 <w:b/>
               </w:rPr>
-              <w:t xml:space="preserve"> </w:t>
-            </w:r>
-            <w:r>
-              <w:rPr>
-                <w:rFonts w:ascii="Arial" w:hAnsi="Arial" w:cs="Arial"/>
-                <w:b/>
-              </w:rPr>
-              <w:t>Parcial</w:t>
+              <w:t xml:space="preserve"> Parcial</w:t>
             </w:r>
           </w:p>
         </w:tc>
@@ -1143,23 +986,7 @@
                 <w:sz w:val="16"/>
                 <w:szCs w:val="16"/>
               </w:rPr>
-              <w:t>Nome do</w:t>
-            </w:r>
-            <w:r>
-              <w:rPr>
-                <w:rFonts w:ascii="Arial" w:hAnsi="Arial" w:cs="Arial"/>
-                <w:sz w:val="16"/>
-                <w:szCs w:val="16"/>
-              </w:rPr>
-              <w:t>(a)</w:t>
-            </w:r>
-            <w:r>
-              <w:rPr>
-                <w:rFonts w:ascii="Arial" w:hAnsi="Arial" w:cs="Arial"/>
-                <w:sz w:val="16"/>
-                <w:szCs w:val="16"/>
-              </w:rPr>
-              <w:t xml:space="preserve"> Bolsista </w:t>
+              <w:t xml:space="preserve">Nome do(a) Bolsista </w:t>
             </w:r>
             <w:r>
               <w:rPr>
@@ -1442,47 +1269,7 @@
                 <w:sz w:val="22"/>
                 <w:szCs w:val="22"/>
               </w:rPr>
-              <w:t> </w:t>
-            </w:r>
-            <w:r>
-              <w:rPr>
-                <w:rFonts w:ascii="Arial" w:hAnsi="Arial" w:cs="Arial"/>
-                <w:b/>
-                <w:noProof/>
-                <w:sz w:val="22"/>
-                <w:szCs w:val="22"/>
-              </w:rPr>
-              <w:t> </w:t>
-            </w:r>
-            <w:r>
-              <w:rPr>
-                <w:rFonts w:ascii="Arial" w:hAnsi="Arial" w:cs="Arial"/>
-                <w:b/>
-                <w:noProof/>
-                <w:sz w:val="22"/>
-                <w:szCs w:val="22"/>
-              </w:rPr>
-              <w:t> </w:t>
-            </w:r>
-            <w:r>
-              <w:rPr>
-                <w:rFonts w:ascii="Arial" w:hAnsi="Arial" w:cs="Arial"/>
-                <w:b/>
-                <w:noProof/>
-                <w:sz w:val="22"/>
-                <w:szCs w:val="22"/>
-              </w:rPr>
-              <w:t> </w:t>
-            </w:r>
-            <w:r>
-              <w:rPr>
-                <w:rFonts w:ascii="Arial" w:hAnsi="Arial" w:cs="Arial"/>
-                <w:b/>
-                <w:noProof/>
-                <w:sz w:val="22"/>
-                <w:szCs w:val="22"/>
-              </w:rPr>
-              <w:t> </w:t>
+              <w:t>     </w:t>
             </w:r>
             <w:r>
               <w:rPr>
@@ -1521,15 +1308,7 @@
                 <w:sz w:val="16"/>
                 <w:szCs w:val="16"/>
               </w:rPr>
-              <w:t>Duração</w:t>
-            </w:r>
-            <w:r>
-              <w:rPr>
-                <w:rFonts w:ascii="Arial" w:hAnsi="Arial" w:cs="Arial"/>
-                <w:sz w:val="16"/>
-                <w:szCs w:val="16"/>
-              </w:rPr>
-              <w:t xml:space="preserve"> da Bolsa</w:t>
+              <w:t>Duração da Bolsa</w:t>
             </w:r>
           </w:p>
           <w:p>
@@ -1885,13 +1664,7 @@
               <w:rPr>
                 <w:noProof/>
               </w:rPr>
-              <w:t>Instituto de Ciência e Tecnologia</w:t>
-            </w:r>
-            <w:r>
-              <w:rPr>
-                <w:noProof/>
-              </w:rPr>
-              <w:t xml:space="preserve"> Unifesp</w:t>
+              <w:t>Instituto de Ciência e Tecnologia Unifesp</w:t>
             </w:r>
             <w:r>
               <w:rPr>
@@ -1993,53 +1766,15 @@
             </w:r>
             <w:r>
               <w:rPr>
-                <w:rFonts w:ascii="Arial" w:hAnsi="Arial" w:cs="Arial"/>
-                <w:b/>
-                <w:noProof/>
-                <w:sz w:val="20"/>
-                <w:szCs w:val="20"/>
-              </w:rPr>
-              <w:t> </w:t>
-            </w:r>
-            <w:r>
-              <w:rPr>
-                <w:rFonts w:ascii="Arial" w:hAnsi="Arial" w:cs="Arial"/>
-                <w:b/>
-                <w:noProof/>
-                <w:sz w:val="20"/>
-                <w:szCs w:val="20"/>
-              </w:rPr>
-              <w:t> </w:t>
-            </w:r>
-            <w:r>
-              <w:rPr>
-                <w:rFonts w:ascii="Arial" w:hAnsi="Arial" w:cs="Arial"/>
-                <w:b/>
-                <w:noProof/>
-                <w:sz w:val="20"/>
-                <w:szCs w:val="20"/>
-              </w:rPr>
-              <w:t> </w:t>
-            </w:r>
-            <w:r>
-              <w:rPr>
-                <w:rFonts w:ascii="Arial" w:hAnsi="Arial" w:cs="Arial"/>
-                <w:b/>
-                <w:noProof/>
-                <w:sz w:val="20"/>
-                <w:szCs w:val="20"/>
-              </w:rPr>
-              <w:t> </w:t>
-            </w:r>
-            <w:r>
-              <w:rPr>
-                <w:rFonts w:ascii="Arial" w:hAnsi="Arial" w:cs="Arial"/>
-                <w:b/>
-                <w:noProof/>
-                <w:sz w:val="20"/>
-                <w:szCs w:val="20"/>
-              </w:rPr>
-              <w:t> </w:t>
+                <w:noProof/>
+              </w:rPr>
+              <w:t>Ciência</w:t>
+            </w:r>
+            <w:r>
+              <w:rPr>
+                <w:noProof/>
+              </w:rPr>
+              <w:t xml:space="preserve"> e tecnologia</w:t>
             </w:r>
             <w:r>
               <w:rPr>
@@ -2082,14 +1817,7 @@
                 <w:rFonts w:ascii="Arial" w:hAnsi="Arial" w:cs="Arial"/>
                 <w:sz w:val="16"/>
               </w:rPr>
-              <w:t>Laboratório/Núcleo</w:t>
-            </w:r>
-            <w:r>
-              <w:rPr>
-                <w:rFonts w:ascii="Arial" w:hAnsi="Arial" w:cs="Arial"/>
-                <w:sz w:val="16"/>
-              </w:rPr>
-              <w:t xml:space="preserve"> </w:t>
+              <w:t xml:space="preserve">Laboratório/Núcleo </w:t>
             </w:r>
             <w:r>
               <w:rPr>
@@ -2172,53 +1900,9 @@
             </w:r>
             <w:r>
               <w:rPr>
-                <w:rFonts w:ascii="Arial" w:hAnsi="Arial" w:cs="Arial"/>
-                <w:b/>
-                <w:noProof/>
-                <w:sz w:val="20"/>
-                <w:szCs w:val="20"/>
-              </w:rPr>
-              <w:t> </w:t>
-            </w:r>
-            <w:r>
-              <w:rPr>
-                <w:rFonts w:ascii="Arial" w:hAnsi="Arial" w:cs="Arial"/>
-                <w:b/>
-                <w:noProof/>
-                <w:sz w:val="20"/>
-                <w:szCs w:val="20"/>
-              </w:rPr>
-              <w:t> </w:t>
-            </w:r>
-            <w:r>
-              <w:rPr>
-                <w:rFonts w:ascii="Arial" w:hAnsi="Arial" w:cs="Arial"/>
-                <w:b/>
-                <w:noProof/>
-                <w:sz w:val="20"/>
-                <w:szCs w:val="20"/>
-              </w:rPr>
-              <w:t> </w:t>
-            </w:r>
-            <w:r>
-              <w:rPr>
-                <w:rFonts w:ascii="Arial" w:hAnsi="Arial" w:cs="Arial"/>
-                <w:b/>
-                <w:noProof/>
-                <w:sz w:val="20"/>
-                <w:szCs w:val="20"/>
-              </w:rPr>
-              <w:t> </w:t>
-            </w:r>
-            <w:r>
-              <w:rPr>
-                <w:rFonts w:ascii="Arial" w:hAnsi="Arial" w:cs="Arial"/>
-                <w:b/>
-                <w:noProof/>
-                <w:sz w:val="20"/>
-                <w:szCs w:val="20"/>
-              </w:rPr>
-              <w:t> </w:t>
+                <w:noProof/>
+              </w:rPr>
+              <w:t>Cidag</w:t>
             </w:r>
             <w:r>
               <w:rPr>
@@ -2260,35 +1944,7 @@
                 <w:rFonts w:ascii="Arial" w:hAnsi="Arial" w:cs="Arial"/>
                 <w:sz w:val="16"/>
               </w:rPr>
-              <w:t>Nome do</w:t>
-            </w:r>
-            <w:r>
-              <w:rPr>
-                <w:rFonts w:ascii="Arial" w:hAnsi="Arial" w:cs="Arial"/>
-                <w:sz w:val="16"/>
-              </w:rPr>
-              <w:t>(a)</w:t>
-            </w:r>
-            <w:r>
-              <w:rPr>
-                <w:rFonts w:ascii="Arial" w:hAnsi="Arial" w:cs="Arial"/>
-                <w:sz w:val="16"/>
-              </w:rPr>
-              <w:t xml:space="preserve"> Coordenador</w:t>
-            </w:r>
-            <w:r>
-              <w:rPr>
-                <w:rFonts w:ascii="Arial" w:hAnsi="Arial" w:cs="Arial"/>
-                <w:sz w:val="16"/>
-              </w:rPr>
-              <w:t>(a)</w:t>
-            </w:r>
-            <w:r>
-              <w:rPr>
-                <w:rFonts w:ascii="Arial" w:hAnsi="Arial" w:cs="Arial"/>
-                <w:sz w:val="16"/>
-              </w:rPr>
-              <w:t xml:space="preserve"> do Projeto</w:t>
+              <w:t>Nome do(a) Coordenador(a) do Projeto</w:t>
             </w:r>
           </w:p>
           <w:p>
@@ -2346,53 +2002,9 @@
             </w:r>
             <w:r>
               <w:rPr>
-                <w:rFonts w:ascii="Arial" w:hAnsi="Arial" w:cs="Arial"/>
-                <w:b/>
-                <w:noProof/>
-                <w:sz w:val="20"/>
-                <w:szCs w:val="20"/>
-              </w:rPr>
-              <w:t> </w:t>
-            </w:r>
-            <w:r>
-              <w:rPr>
-                <w:rFonts w:ascii="Arial" w:hAnsi="Arial" w:cs="Arial"/>
-                <w:b/>
-                <w:noProof/>
-                <w:sz w:val="20"/>
-                <w:szCs w:val="20"/>
-              </w:rPr>
-              <w:t> </w:t>
-            </w:r>
-            <w:r>
-              <w:rPr>
-                <w:rFonts w:ascii="Arial" w:hAnsi="Arial" w:cs="Arial"/>
-                <w:b/>
-                <w:noProof/>
-                <w:sz w:val="20"/>
-                <w:szCs w:val="20"/>
-              </w:rPr>
-              <w:t> </w:t>
-            </w:r>
-            <w:r>
-              <w:rPr>
-                <w:rFonts w:ascii="Arial" w:hAnsi="Arial" w:cs="Arial"/>
-                <w:b/>
-                <w:noProof/>
-                <w:sz w:val="20"/>
-                <w:szCs w:val="20"/>
-              </w:rPr>
-              <w:t> </w:t>
-            </w:r>
-            <w:r>
-              <w:rPr>
-                <w:rFonts w:ascii="Arial" w:hAnsi="Arial" w:cs="Arial"/>
-                <w:b/>
-                <w:noProof/>
-                <w:sz w:val="20"/>
-                <w:szCs w:val="20"/>
-              </w:rPr>
-              <w:t> </w:t>
+                <w:noProof/>
+              </w:rPr>
+              <w:t>Juarez L. F. Da Silva</w:t>
             </w:r>
             <w:r>
               <w:rPr>
@@ -2430,35 +2042,7 @@
                 <w:rFonts w:ascii="Arial" w:hAnsi="Arial" w:cs="Arial"/>
                 <w:sz w:val="16"/>
               </w:rPr>
-              <w:t>Nome do</w:t>
-            </w:r>
-            <w:r>
-              <w:rPr>
-                <w:rFonts w:ascii="Arial" w:hAnsi="Arial" w:cs="Arial"/>
-                <w:sz w:val="16"/>
-              </w:rPr>
-              <w:t>(a)</w:t>
-            </w:r>
-            <w:r>
-              <w:rPr>
-                <w:rFonts w:ascii="Arial" w:hAnsi="Arial" w:cs="Arial"/>
-                <w:sz w:val="16"/>
-              </w:rPr>
-              <w:t xml:space="preserve"> </w:t>
-            </w:r>
-            <w:r>
-              <w:rPr>
-                <w:rFonts w:ascii="Arial" w:hAnsi="Arial" w:cs="Arial"/>
-                <w:sz w:val="16"/>
-              </w:rPr>
-              <w:t>Orientador</w:t>
-            </w:r>
-            <w:r>
-              <w:rPr>
-                <w:rFonts w:ascii="Arial" w:hAnsi="Arial" w:cs="Arial"/>
-                <w:sz w:val="16"/>
-              </w:rPr>
-              <w:t>(a)</w:t>
+              <w:t>Nome do(a) Orientador(a)</w:t>
             </w:r>
           </w:p>
           <w:p>
@@ -2819,34 +2403,7 @@
                 <w:sz w:val="18"/>
                 <w:szCs w:val="18"/>
               </w:rPr>
-              <w:t xml:space="preserve">Principais objetivos </w:t>
-            </w:r>
-            <w:r>
-              <w:rPr>
-                <w:rFonts w:ascii="Arial" w:hAnsi="Arial" w:cs="Arial"/>
-                <w:b/>
-                <w:sz w:val="18"/>
-                <w:szCs w:val="18"/>
-              </w:rPr>
-              <w:t xml:space="preserve">iniciais </w:t>
-            </w:r>
-            <w:r>
-              <w:rPr>
-                <w:rFonts w:ascii="Arial" w:hAnsi="Arial" w:cs="Arial"/>
-                <w:b/>
-                <w:sz w:val="18"/>
-                <w:szCs w:val="18"/>
-              </w:rPr>
-              <w:t xml:space="preserve">do Plano de </w:t>
-            </w:r>
-            <w:r>
-              <w:rPr>
-                <w:rFonts w:ascii="Arial" w:hAnsi="Arial" w:cs="Arial"/>
-                <w:b/>
-                <w:sz w:val="18"/>
-                <w:szCs w:val="18"/>
-              </w:rPr>
-              <w:t>Pesquisa</w:t>
+              <w:t>Principais objetivos iniciais do Plano de Pesquisa</w:t>
             </w:r>
           </w:p>
         </w:tc>
@@ -2922,96 +2479,33 @@
               <w:rPr>
                 <w:noProof/>
               </w:rPr>
-              <w:t xml:space="preserve">(i) </w:t>
-            </w:r>
-            <w:r>
-              <w:t>D</w:t>
-            </w:r>
-            <w:r>
-              <w:rPr>
-                <w:noProof/>
-              </w:rPr>
-              <w:t xml:space="preserve">esenvolver modelos de aprendizado profundo (CNN1D, LSTM e Transformer) para detecção e predição precoce de falhas em turbinas eólicas a partir de dados SCADA; </w:t>
-            </w:r>
-          </w:p>
-          <w:p>
-            <w:pPr>
-              <w:rPr>
-                <w:noProof/>
-              </w:rPr>
-            </w:pPr>
-            <w:r>
-              <w:rPr>
-                <w:noProof/>
-              </w:rPr>
-              <w:t xml:space="preserve">(ii) </w:t>
-            </w:r>
-            <w:r>
-              <w:t>I</w:t>
-            </w:r>
-            <w:r>
-              <w:rPr>
-                <w:noProof/>
-              </w:rPr>
-              <w:t xml:space="preserve">ntegrar variáveis meteorológicas exógenas (CPTEC/INPE e OpenWeatherMap) ao pipeline preditivo; </w:t>
-            </w:r>
-          </w:p>
-          <w:p>
-            <w:pPr>
-              <w:rPr>
-                <w:noProof/>
-              </w:rPr>
-            </w:pPr>
-            <w:r>
-              <w:rPr>
-                <w:noProof/>
-              </w:rPr>
-              <w:t xml:space="preserve">(iii) </w:t>
-            </w:r>
-            <w:r>
-              <w:t>C</w:t>
-            </w:r>
-            <w:r>
-              <w:rPr>
-                <w:noProof/>
-              </w:rPr>
-              <w:t>omparar duas variantes principais</w:t>
-            </w:r>
-            <w:r>
-              <w:rPr>
-                <w:noProof/>
-              </w:rPr>
-              <w:t>:</w:t>
-            </w:r>
-            <w:r>
-              <w:rPr>
-                <w:noProof/>
-              </w:rPr>
-              <w:t xml:space="preserve"> modelos com dados exógenos </w:t>
-            </w:r>
-            <w:r>
-              <w:rPr>
-                <w:noProof/>
-              </w:rPr>
-              <w:t>e</w:t>
-            </w:r>
-            <w:r>
-              <w:rPr>
-                <w:noProof/>
-              </w:rPr>
-              <w:t xml:space="preserve"> modelos somente com SCADA</w:t>
-            </w:r>
-            <w:r>
-              <w:rPr>
-                <w:noProof/>
-              </w:rPr>
-              <w:t xml:space="preserve">, </w:t>
-            </w:r>
-            <w:r>
-              <w:rPr>
-                <w:noProof/>
-              </w:rPr>
-              <w:t xml:space="preserve">para quantificar o ganho do enriquecimento meteorológico; </w:t>
+              <w:t xml:space="preserve">(i) Desenvolver modelos de aprendizado profundo (CNN1D (One-Dimensional Convolutional Neural Network), LSTM (Long Short-Term Memory) e Transformer) para detecção e predição precoce de falhas em turbinas eólicas a partir de dados SCADA (Supervisory Control and Data Acquisition); </w:t>
+            </w:r>
+          </w:p>
+          <w:p>
+            <w:pPr>
+              <w:rPr>
+                <w:noProof/>
+              </w:rPr>
+            </w:pPr>
+            <w:r>
+              <w:rPr>
+                <w:noProof/>
+              </w:rPr>
+              <w:t xml:space="preserve">(ii) Integrar variáveis meteorológicas exógenas (CPTEC/INPE (Centro de Previsão de Tempo e Estudos Climáticos / Instituto Nacional de Pesquisas Espaciais) e OpenWeatherMap) ao pipeline preditivo; </w:t>
+            </w:r>
+          </w:p>
+          <w:p>
+            <w:pPr>
+              <w:rPr>
+                <w:noProof/>
+              </w:rPr>
+            </w:pPr>
+            <w:r>
+              <w:rPr>
+                <w:noProof/>
+              </w:rPr>
+              <w:t xml:space="preserve">(iii) Comparar duas variantes principais: modelos com dados exógenos e modelos somente com SCADA, para quantificar o ganho do enriquecimento meteorológico; </w:t>
             </w:r>
           </w:p>
           <w:p>
@@ -3038,28 +2532,7 @@
               <w:rPr>
                 <w:noProof/>
               </w:rPr>
-              <w:t xml:space="preserve">(v) </w:t>
-            </w:r>
-            <w:r>
-              <w:t>C</w:t>
-            </w:r>
-            <w:r>
-              <w:rPr>
-                <w:noProof/>
-              </w:rPr>
-              <w:t>apacitar o bolsista nos fundamentos teóricos (MLP, RNN/LSTM, CNN, atenção, autoencoders) e nas ferramentas computacionais (PyTorch, TensorFlow/Keras, scikit-learn, Optuna</w:t>
-            </w:r>
-            <w:r>
-              <w:rPr>
-                <w:noProof/>
-              </w:rPr>
-              <w:t>, Pandas, Numpy</w:t>
-            </w:r>
-            <w:r>
-              <w:rPr>
-                <w:noProof/>
-              </w:rPr>
-              <w:t>). As atividades A1–A9 do cronograma original cobriam revisão de literatura, estudo teórico, coleta de dados, treinamento sem e com exógenos, avaliação comparativa, análise interpretativa e relatórios.</w:t>
+              <w:t>(v) Capacitar o bolsista nos fundamentos teóricos (MLP (Multilayer Perceptron), RNN (Recurrent Neural Network)/LSTM, CNN (Convolutional Neural Network), atenção, autoencoders) e nas ferramentas computacionais (PyTorch, TensorFlow/Keras, scikit-learn, Optuna, Pandas, Numpy). As atividades A1–A9 do cronograma original cobriam revisão de literatura, estudo teórico, coleta de dados, treinamento sem e com exógenos, avaliação comparativa, análise interpretativa e relatórios.</w:t>
             </w:r>
             <w:r>
               <w:rPr>
@@ -3212,141 +2685,153 @@
               <w:rPr>
                 <w:noProof/>
               </w:rPr>
-              <w:t xml:space="preserve">A1 (Literatura) — concluído continuamente; </w:t>
-            </w:r>
-          </w:p>
-          <w:p>
-            <w:pPr>
-              <w:rPr>
-                <w:noProof/>
-              </w:rPr>
-            </w:pPr>
-            <w:r>
-              <w:rPr>
-                <w:noProof/>
-              </w:rPr>
-              <w:t xml:space="preserve">A2 (ML básico) — concluído via curso de Redes Neurais Artificiais do orientador acompanhado integralmente, com exercícios práticos em PyTorch; </w:t>
-            </w:r>
-          </w:p>
-          <w:p>
-            <w:pPr>
-              <w:rPr>
-                <w:noProof/>
-              </w:rPr>
-            </w:pPr>
-            <w:r>
-              <w:rPr>
-                <w:noProof/>
-              </w:rPr>
-              <w:t xml:space="preserve">A3 (Pré-processamento e Modelos) — concluído (LSTM, CNN, mecanismo de atenção implementados; o Transformer completo </w:t>
-            </w:r>
-            <w:r>
-              <w:t>não</w:t>
-            </w:r>
-            <w:r>
-              <w:rPr>
-                <w:noProof/>
-              </w:rPr>
-              <w:t xml:space="preserve"> foi implementado, apenas a camada MultiHeadAttention dentro do encoder do NB2); </w:t>
-            </w:r>
-          </w:p>
-          <w:p>
-            <w:pPr>
-              <w:rPr>
-                <w:noProof/>
-              </w:rPr>
-            </w:pPr>
-            <w:r>
-              <w:rPr>
-                <w:noProof/>
-              </w:rPr>
-              <w:t>A4 (Coleta de Dados) — SCADA concluído dataset CARE_To_Compare, Wind Farm C, ~3,18 milhões de amostras, 957 colunas, razão Normal:Anomalia ≈ 51:1</w:t>
-            </w:r>
-            <w:r>
-              <w:rPr>
-                <w:noProof/>
-              </w:rPr>
-              <w:t>. D</w:t>
-            </w:r>
-            <w:r>
-              <w:rPr>
-                <w:noProof/>
-              </w:rPr>
-              <w:t xml:space="preserve">ados meteorológicos exógenos foram </w:t>
-            </w:r>
-            <w:r>
-              <w:rPr>
-                <w:noProof/>
-              </w:rPr>
-              <w:t>inviáveis</w:t>
-            </w:r>
-            <w:r>
-              <w:rPr>
-                <w:noProof/>
-              </w:rPr>
-              <w:t xml:space="preserve"> porque o repositório público anonimiza coordenadas geográficas, impossibilitando o alinhamento espaço-temporal com bases climáticas externas (Seção 7.3 do relatório técnico); </w:t>
-            </w:r>
-          </w:p>
-          <w:p>
-            <w:pPr>
-              <w:rPr>
-                <w:noProof/>
-              </w:rPr>
-            </w:pPr>
-            <w:r>
-              <w:rPr>
-                <w:noProof/>
-              </w:rPr>
-              <w:t>A5 (Treino sem exógenos) — concluído (cinco notebooks executados);</w:t>
-            </w:r>
-          </w:p>
-          <w:p>
-            <w:pPr>
-              <w:rPr>
-                <w:noProof/>
-              </w:rPr>
-            </w:pPr>
+              <w:t xml:space="preserve">A1 (Literatura) — A revisão da literatura foi realizada de forma contínua ao longo de todo o período. Foram coletados e lidos cerca de </w:t>
+            </w:r>
+            <w:r>
+              <w:t>27</w:t>
+            </w:r>
+            <w:r>
+              <w:rPr>
+                <w:noProof/>
+              </w:rPr>
+              <w:t xml:space="preserve"> </w:t>
+            </w:r>
+            <w:r>
+              <w:t>documentos</w:t>
+            </w:r>
+            <w:r>
+              <w:rPr>
+                <w:noProof/>
+              </w:rPr>
+              <w:t xml:space="preserve"> relacionados aos tópicos: detecção de anomalias em turbinas eólicas via SCADA, arquiteturas de aprendizado profundo (CNN, LSTM, Transformer, autoencoders), métricas para dados desbalanceados, aprendizado não supervisionado e o framework CARE Score. As referências estão consolidadas em </w:t>
+            </w:r>
+            <w:hyperlink r:id="rId9" w:history="1">
+              <w:r>
+                <w:rPr>
+                  <w:rStyle w:val="Hyperlink"/>
+                  <w:noProof/>
+                </w:rPr>
+                <w:t>referencias.bib</w:t>
+              </w:r>
+            </w:hyperlink>
+            <w:r>
+              <w:rPr>
+                <w:noProof/>
+              </w:rPr>
+              <w:t xml:space="preserve">; </w:t>
+            </w:r>
+          </w:p>
+          <w:p>
+            <w:pPr>
+              <w:rPr>
+                <w:noProof/>
+              </w:rPr>
+            </w:pPr>
+            <w:r>
+              <w:rPr>
+                <w:noProof/>
+              </w:rPr>
+              <w:t xml:space="preserve">A2 (ML básico) — concluído via curso de Redes Neurais Artificiais do orientador acompanhado integralmente, com exercícios práticos em PyTorch. Neste curso o bolsista teve a oportunidade de aprender diferentes arquiteturas de redes neurais, como Perceptron, MLP, CNN, RNN/LSTM, </w:t>
+            </w:r>
             <w:r>
               <w:rPr>
                 <w:noProof/>
               </w:rPr>
               <w:lastRenderedPageBreak/>
-              <w:t xml:space="preserve">A6 (Treino com exógenos) — </w:t>
-            </w:r>
-            <w:r>
-              <w:t>cancelado</w:t>
-            </w:r>
-            <w:r>
-              <w:rPr>
-                <w:noProof/>
-              </w:rPr>
-              <w:t xml:space="preserve"> em razão da inviabilidade do A4; substituído por dois notebooks adicionais (NB4 e NB5) com data augmentation via injeção de falhas sintéticas; </w:t>
-            </w:r>
-          </w:p>
-          <w:p>
-            <w:pPr>
-              <w:rPr>
-                <w:noProof/>
-              </w:rPr>
-            </w:pPr>
-            <w:r>
-              <w:rPr>
-                <w:noProof/>
-              </w:rPr>
-              <w:t xml:space="preserve">A7 (Avaliação) — concluído com métricas amostrais (Precision, Recall, F1, AUC-ROC) e métricas event-level do framework CARE Score; </w:t>
-            </w:r>
-          </w:p>
-          <w:p>
-            <w:pPr>
-              <w:rPr>
-                <w:noProof/>
-              </w:rPr>
-            </w:pPr>
-            <w:r>
-              <w:rPr>
-                <w:noProof/>
-              </w:rPr>
-              <w:t xml:space="preserve">A8 (Análise) — concluído com discussão consolidada (Seção 10.3 do relatório); </w:t>
+              <w:t xml:space="preserve">mecanismos de atenção e autoencoders, além de tópicos de regularização, otimização e avaliação de modelos; </w:t>
+            </w:r>
+          </w:p>
+          <w:p>
+            <w:pPr>
+              <w:rPr>
+                <w:noProof/>
+              </w:rPr>
+            </w:pPr>
+            <w:r>
+              <w:rPr>
+                <w:noProof/>
+              </w:rPr>
+              <w:t xml:space="preserve">A3 (Pré-processamento e Modelos) — concluído. Foram implementados pipelines de pré-processamento (limpeza de NaN, normalização por estado operacional, janelamento temporal e splits sem leakage entre treino, validação e teste) e arquiteturas LSTM, CNN, CNN-LSTM, CNN-BiLSTM-Attention Autoencoder e MLP Autoencoder. O Transformer completo não foi implementado, apenas a camada MultiHeadAttention dentro do encoder do NB2 (Notebook 2); </w:t>
+            </w:r>
+          </w:p>
+          <w:p>
+            <w:pPr>
+              <w:rPr>
+                <w:noProof/>
+              </w:rPr>
+            </w:pPr>
+            <w:r>
+              <w:rPr>
+                <w:noProof/>
+              </w:rPr>
+              <w:t xml:space="preserve">A4 (Coleta de Dados) — SCADA concluído com o dataset </w:t>
+            </w:r>
+            <w:hyperlink r:id="rId10" w:history="1">
+              <w:r>
+                <w:rPr>
+                  <w:rStyle w:val="Hyperlink"/>
+                  <w:noProof/>
+                </w:rPr>
+                <w:t>CARE_To_Compare</w:t>
+              </w:r>
+            </w:hyperlink>
+            <w:r>
+              <w:rPr>
+                <w:noProof/>
+              </w:rPr>
+              <w:t xml:space="preserve"> (https://zenodo.org/records/15846963), Wind Farm C, ~3,18 milhões de amostras, 957 colunas, razão Normal:Anomalia ≈ 51:1. Dados meteorológicos exógenos foram inviáveis porque o repositório público anonimiza coordenadas geográficas, impossibilitando o alinhamento espaço-temporal com bases climáticas externas (Seção 7.3 do relatório técnico); </w:t>
+            </w:r>
+          </w:p>
+          <w:p>
+            <w:pPr>
+              <w:rPr>
+                <w:noProof/>
+              </w:rPr>
+            </w:pPr>
+            <w:r>
+              <w:rPr>
+                <w:noProof/>
+              </w:rPr>
+              <w:t>A5 (Treino sem exógenos) — concluído com cinco notebooks executados sobre dados SCADA puros (sem exógenos): NB1 (CNN/LSTM/CNN-LSTM supervisionados em PyTorch), NB2 (CNN-BiLSTM-Attention Autoencoder em PyTorch), NB3 (MLP Autoencoder em Keras com Optuna), NB4 (Classificador MLP com falhas sintéticas) e NB5 (Autoencoder MLP com calibração por falhas induzidas);</w:t>
+            </w:r>
+          </w:p>
+          <w:p>
+            <w:pPr>
+              <w:rPr>
+                <w:noProof/>
+              </w:rPr>
+            </w:pPr>
+            <w:r>
+              <w:rPr>
+                <w:noProof/>
+              </w:rPr>
+              <w:t xml:space="preserve">A6 (Treino com exógenos) — cancelado em razão da inviabilidade do A4 (anonimização de coordenadas geográficas no dataset público); substituído por dois notebooks adicionais (NB4 e NB5) com data augmentation via injeção de falhas sintéticas, que permitiram explorar paradigmas alternativos de detecção sem dados meteorológicos externos; </w:t>
+            </w:r>
+          </w:p>
+          <w:p>
+            <w:pPr>
+              <w:rPr>
+                <w:noProof/>
+              </w:rPr>
+            </w:pPr>
+            <w:r>
+              <w:rPr>
+                <w:noProof/>
+              </w:rPr>
+              <w:t xml:space="preserve">A7 (Avaliação) — concluído com avaliação sistemática dos cinco notebooks usando métricas amostrais (Precision, Recall, F1, AUC-ROC (Area Under the Receiver Operating Characteristic curve)) e métricas event-level do framework CARE Score (Composite Anomaly Reliability Evaluation), permitindo comparação direta entre paradigmas supervisionado e não supervisionado sob desbalanceamento severo; </w:t>
+            </w:r>
+          </w:p>
+          <w:p>
+            <w:pPr>
+              <w:rPr>
+                <w:noProof/>
+              </w:rPr>
+            </w:pPr>
+            <w:r>
+              <w:rPr>
+                <w:noProof/>
+              </w:rPr>
+              <w:t xml:space="preserve">A8 (Análise) — concluído com discussão consolidada (Seção 10.3 do relatório técnico). Foram comparados os cinco notebooks quanto a desempenho preditivo, comportamento sob desbalanceamento severo, trade-off entre Recall e Precision em nível de evento, e identificadas as limitações de cada paradigma (supervisionado vs. não supervisionado, calibração por falhas induzidas vs. percentil global); </w:t>
             </w:r>
           </w:p>
           <w:p>
@@ -3360,31 +2845,37 @@
               <w:rPr>
                 <w:noProof/>
               </w:rPr>
-              <w:t>A9 (Relatórios) — concluído com este Relatório FUSP e o relatório técnico completo (relatorio</w:t>
-            </w:r>
-            <w:r>
-              <w:rPr>
-                <w:noProof/>
-              </w:rPr>
-              <w:t xml:space="preserve"> i</w:t>
-            </w:r>
-            <w:r>
-              <w:rPr>
-                <w:noProof/>
-              </w:rPr>
-              <w:t xml:space="preserve">c.pdf, </w:t>
-            </w:r>
-            <w:r>
-              <w:rPr>
-                <w:noProof/>
-              </w:rPr>
-              <w:t>disponivel no github</w:t>
-            </w:r>
-            <w:r>
-              <w:rPr>
-                <w:noProof/>
-              </w:rPr>
-              <w:t>).</w:t>
+              <w:t>A9 (Relatórios) — concluído com este Relatório FUSP e o relatório técnico completo (</w:t>
+            </w:r>
+            <w:hyperlink r:id="rId11" w:history="1">
+              <w:r>
+                <w:rPr>
+                  <w:rStyle w:val="Hyperlink"/>
+                  <w:noProof/>
+                </w:rPr>
+                <w:t>relatorio_ic.pdf</w:t>
+              </w:r>
+            </w:hyperlink>
+            <w:r>
+              <w:rPr>
+                <w:noProof/>
+              </w:rPr>
+              <w:t xml:space="preserve">), além de READMEs por experimento, métricas consolidadas e slides de apresentação, todos disponíveis no repositório público do GitHub: </w:t>
+            </w:r>
+            <w:hyperlink r:id="rId12" w:history="1">
+              <w:r>
+                <w:rPr>
+                  <w:rStyle w:val="Hyperlink"/>
+                  <w:noProof/>
+                </w:rPr>
+                <w:t>https://github.com/Thiago-Heleno/IC_Thiago-Heleno_Wind_Turbines</w:t>
+              </w:r>
+            </w:hyperlink>
+            <w:r>
+              <w:rPr>
+                <w:noProof/>
+              </w:rPr>
+              <w:t>.</w:t>
             </w:r>
             <w:r>
               <w:rPr>
@@ -3451,70 +2942,7 @@
                 <w:sz w:val="18"/>
                 <w:szCs w:val="18"/>
               </w:rPr>
-              <w:t>P</w:t>
-            </w:r>
-            <w:r>
-              <w:rPr>
-                <w:rFonts w:ascii="Arial" w:hAnsi="Arial" w:cs="Arial"/>
-                <w:b/>
-                <w:sz w:val="18"/>
-                <w:szCs w:val="18"/>
-              </w:rPr>
-              <w:t xml:space="preserve"> P</w:t>
-            </w:r>
-            <w:r>
-              <w:rPr>
-                <w:rFonts w:ascii="Arial" w:hAnsi="Arial" w:cs="Arial"/>
-                <w:b/>
-                <w:sz w:val="18"/>
-                <w:szCs w:val="18"/>
-              </w:rPr>
-              <w:t xml:space="preserve">rincipais </w:t>
-            </w:r>
-            <w:r>
-              <w:rPr>
-                <w:rFonts w:ascii="Arial" w:hAnsi="Arial" w:cs="Arial"/>
-                <w:b/>
-                <w:sz w:val="18"/>
-                <w:szCs w:val="18"/>
-              </w:rPr>
-              <w:t>resultados</w:t>
-            </w:r>
-            <w:r>
-              <w:rPr>
-                <w:rFonts w:ascii="Arial" w:hAnsi="Arial" w:cs="Arial"/>
-                <w:b/>
-                <w:sz w:val="18"/>
-                <w:szCs w:val="18"/>
-              </w:rPr>
-              <w:t xml:space="preserve"> </w:t>
-            </w:r>
-            <w:r>
-              <w:rPr>
-                <w:rFonts w:ascii="Arial" w:hAnsi="Arial" w:cs="Arial"/>
-                <w:b/>
-                <w:sz w:val="18"/>
-                <w:szCs w:val="18"/>
-              </w:rPr>
-              <w:t>alcançados</w:t>
-            </w:r>
-            <w:r>
-              <w:rPr>
-                <w:rFonts w:ascii="Arial" w:hAnsi="Arial" w:cs="Arial"/>
-                <w:b/>
-                <w:sz w:val="18"/>
-                <w:szCs w:val="18"/>
-              </w:rPr>
-              <w:t xml:space="preserve"> pelas atividades desenvolvidas durante </w:t>
-            </w:r>
-            <w:r>
-              <w:rPr>
-                <w:rFonts w:ascii="Arial" w:hAnsi="Arial" w:cs="Arial"/>
-                <w:b/>
-                <w:sz w:val="18"/>
-                <w:szCs w:val="18"/>
-              </w:rPr>
-              <w:t>a pesquisa</w:t>
+              <w:t>P Principais resultados alcançados pelas atividades desenvolvidas durante a pesquisa</w:t>
             </w:r>
           </w:p>
           <w:p>
@@ -3616,72 +3044,180 @@
               <w:rPr>
                 <w:noProof/>
               </w:rPr>
-              <w:t>Cinco notebooks foram implementados, executados e documentados (relatório técnico, Tabela 7 e Seção 5.2 de relatorio_ic.pdf). Resultados principais no conjunto de teste do Wind Farm C:</w:t>
-            </w:r>
-          </w:p>
-          <w:p>
-            <w:pPr>
-              <w:rPr>
-                <w:noProof/>
-              </w:rPr>
-            </w:pPr>
-            <w:r>
-              <w:rPr>
-                <w:noProof/>
-              </w:rPr>
-              <w:t>• NB1 — CNN, LSTM e CNN-LSTM supervisionados (PyTorch, ~160 K parâmetros), replicação de Qi et al. (2024). A melhor variante CNN-LSTM atingiu AUC-ROC = 0,66 e F1 amostral = 0,032; a LSTM isolada colapsou (F1 = 0, AUC = 0,40), evidenciando limitação do paradigma supervisionado sob desbalanceamento severo.</w:t>
-            </w:r>
-          </w:p>
-          <w:p>
-            <w:pPr>
-              <w:rPr>
-                <w:noProof/>
-              </w:rPr>
-            </w:pPr>
-            <w:r>
-              <w:rPr>
-                <w:noProof/>
-              </w:rPr>
-              <w:t>• NB2 — CNN-BiLSTM-Attention Autoencoder não supervisionado (PyTorch, ~954 K parâmetros). AUC-ROC = 0,872 (configuração v4 com Score Ponderado + Beta-F1) e Recall = 88,3%; ablação pós-treino com cinco estratégias incrementais documentada (Tabela 8 do relatório).</w:t>
-            </w:r>
-          </w:p>
-          <w:p>
-            <w:pPr>
-              <w:rPr>
-                <w:noProof/>
-              </w:rPr>
-            </w:pPr>
-            <w:r>
-              <w:rPr>
-                <w:noProof/>
-              </w:rPr>
-              <w:t>• NB3 — MLP Autoencoder não supervisionado (Keras/TensorFlow, ~150 K parâmetros) com otimização Optuna em dois estudos sucessivos (50 + 50 trials). Avaliação no padrão CARE Score: F1₂ = 0,393, EF1₂ = 0,899, Acc por evento = 0,774, WS = 0,657, CARE = 0,699. Recall por dataset de 94,1% e Precision por dataset de 88,9% (matriz de confusão por dataset: 48 TP / 3 FN / 6 FP / 1 TN sobre 51 anômalos + 7 normais).</w:t>
-            </w:r>
-          </w:p>
-          <w:p>
-            <w:pPr>
-              <w:rPr>
-                <w:noProof/>
-              </w:rPr>
-            </w:pPr>
-            <w:r>
-              <w:rPr>
-                <w:noProof/>
-              </w:rPr>
-              <w:t>• NB4 — Classificador MLP de 3 classes com falhas sintéticas (Keras, ~40 K parâmetros). F1 amostral = 0,674 e Recall = 1,000; entretanto CARE ≈ 3,6 × 10⁻⁶ porque o modelo dispara alarme em todos os eventos normais do split de teste — caso pedagógico que demonstra a importância do CARE Score frente a métricas amostrais isoladas (Seção 10.3, conclusão 5).</w:t>
-            </w:r>
-          </w:p>
-          <w:p>
-            <w:pPr>
-              <w:rPr>
-                <w:noProof/>
-              </w:rPr>
-            </w:pPr>
-            <w:r>
-              <w:rPr>
-                <w:noProof/>
-              </w:rPr>
-              <w:t>• NB5 — Autoencoder MLP com calibração de threshold por falhas induzidas (Keras, ~40 K parâmetros). Comparação de três thresholds (Standard P95, Induced P95, Adaptive); a melhor configuração Induced P95 atingiu CARE = 0,545 com Acc por evento normal = 0,98 e Precision amostral = 0,79 — ponto oposto da curva ROC em relação ao NB3, motivando ensemble como linha futura.</w:t>
+              <w:t xml:space="preserve">Cinco notebooks foram implementados, executados e documentados (relatório técnico, Tabela 7 e Seção 5.2 de </w:t>
+            </w:r>
+            <w:hyperlink r:id="rId13" w:history="1">
+              <w:r>
+                <w:rPr>
+                  <w:rStyle w:val="Hyperlink"/>
+                  <w:noProof/>
+                </w:rPr>
+                <w:t>relatorio_ic.pdf</w:t>
+              </w:r>
+            </w:hyperlink>
+            <w:r>
+              <w:rPr>
+                <w:noProof/>
+              </w:rPr>
+              <w:t>). Resultados principais no conjunto de teste do Wind Farm C:</w:t>
+            </w:r>
+          </w:p>
+          <w:p>
+            <w:pPr>
+              <w:rPr>
+                <w:noProof/>
+                <w:lang w:val="en-US"/>
+              </w:rPr>
+            </w:pPr>
+            <w:r>
+              <w:rPr>
+                <w:noProof/>
+              </w:rPr>
+              <w:t xml:space="preserve">• NB1 — CNN, LSTM e CNN-LSTM supervisionados (PyTorch, ~160 K parâmetros), replicação de Qi et al. (2024). A melhor variante CNN-LSTM atingiu AUC-ROC = 0,66 e F1 amostral = 0,032; a LSTM isolada colapsou (F1 = 0, AUC = 0,40), evidenciando limitação do paradigma supervisionado sob desbalanceamento severo. </w:t>
+            </w:r>
+            <w:r>
+              <w:rPr>
+                <w:noProof/>
+                <w:lang w:val="en-US"/>
+              </w:rPr>
+              <w:t xml:space="preserve">Notebook: </w:t>
+            </w:r>
+            <w:hyperlink r:id="rId14" w:history="1">
+              <w:r>
+                <w:rPr>
+                  <w:rStyle w:val="Hyperlink"/>
+                  <w:noProof/>
+                  <w:lang w:val="en-US"/>
+                </w:rPr>
+                <w:t>wind_turbine_cnn_lstm_paper.ipynb</w:t>
+              </w:r>
+            </w:hyperlink>
+            <w:r>
+              <w:rPr>
+                <w:noProof/>
+                <w:lang w:val="en-US"/>
+              </w:rPr>
+              <w:t>.</w:t>
+            </w:r>
+          </w:p>
+          <w:p>
+            <w:pPr>
+              <w:rPr>
+                <w:noProof/>
+              </w:rPr>
+            </w:pPr>
+            <w:r>
+              <w:rPr>
+                <w:noProof/>
+                <w:lang w:val="en-US"/>
+              </w:rPr>
+              <w:t xml:space="preserve">• NB2 — CNN-BiLSTM (Bidirectional Long Short-Term Memory)-Attention Autoencoder não supervisionado (PyTorch, ~954 K parâmetros). </w:t>
+            </w:r>
+            <w:r>
+              <w:rPr>
+                <w:noProof/>
+              </w:rPr>
+              <w:t xml:space="preserve">AUC-ROC = 0,872 (configuração v4 com Score Ponderado + Beta-F1) e Recall = 88,3%; ablação pós-treino com cinco estratégias incrementais documentada (Tabela 8 do relatório). Notebook: </w:t>
+            </w:r>
+            <w:hyperlink r:id="rId15" w:history="1">
+              <w:r>
+                <w:rPr>
+                  <w:rStyle w:val="Hyperlink"/>
+                  <w:noProof/>
+                </w:rPr>
+                <w:t>wind_turbine_anomaly_detection_v4.ipynb</w:t>
+              </w:r>
+            </w:hyperlink>
+            <w:r>
+              <w:rPr>
+                <w:noProof/>
+              </w:rPr>
+              <w:t>.</w:t>
+            </w:r>
+          </w:p>
+          <w:p>
+            <w:pPr>
+              <w:rPr>
+                <w:noProof/>
+              </w:rPr>
+            </w:pPr>
+            <w:r>
+              <w:rPr>
+                <w:noProof/>
+              </w:rPr>
+              <w:t xml:space="preserve">• NB3 — MLP Autoencoder não supervisionado (Keras/TensorFlow, ~150 K parâmetros) com otimização Optuna em dois estudos sucessivos (50 + 50 trials). Avaliação no padrão CARE Score: F1₂ = 0,393, EF1₂ = 0,899, Acc por evento = 0,774, WS = 0,657, CARE = 0,699. Recall por dataset de 94,1% e Precision por dataset de 88,9% (matriz de confusão por dataset: 48 TP (True Positive) / 3 FN (False Negative) / 6 FP (False Positive) / 1 TN (True Negative) sobre 51 anômalos + 7 normais). Notebook: </w:t>
+            </w:r>
+            <w:hyperlink r:id="rId16" w:history="1">
+              <w:r>
+                <w:rPr>
+                  <w:rStyle w:val="Hyperlink"/>
+                  <w:noProof/>
+                </w:rPr>
+                <w:t>wind_turbine_autoencoder_keras_pipeline.ipynb</w:t>
+              </w:r>
+            </w:hyperlink>
+            <w:r>
+              <w:rPr>
+                <w:noProof/>
+              </w:rPr>
+              <w:t>.</w:t>
+            </w:r>
+          </w:p>
+          <w:p>
+            <w:pPr>
+              <w:rPr>
+                <w:noProof/>
+              </w:rPr>
+            </w:pPr>
+            <w:r>
+              <w:rPr>
+                <w:noProof/>
+              </w:rPr>
+              <w:lastRenderedPageBreak/>
+              <w:t xml:space="preserve">• NB4 — Classificador MLP de 3 classes com falhas sintéticas (Keras, ~40 K parâmetros). F1 amostral = 0,674 e Recall = 1,000; entretanto CARE ≈ 3,6 × 10⁻⁶ porque o modelo dispara alarme em todos os eventos normais do split de teste — caso pedagógico que demonstra a importância do CARE Score frente a métricas amostrais isoladas (Seção 10.3, conclusão 5). Notebook: </w:t>
+            </w:r>
+            <w:hyperlink r:id="rId17" w:history="1">
+              <w:r>
+                <w:rPr>
+                  <w:rStyle w:val="Hyperlink"/>
+                  <w:noProof/>
+                </w:rPr>
+                <w:t>wind_turbine_classifier_induced_failure.ipynb</w:t>
+              </w:r>
+            </w:hyperlink>
+            <w:r>
+              <w:rPr>
+                <w:noProof/>
+              </w:rPr>
+              <w:t>.</w:t>
+            </w:r>
+          </w:p>
+          <w:p>
+            <w:pPr>
+              <w:rPr>
+                <w:noProof/>
+              </w:rPr>
+            </w:pPr>
+            <w:r>
+              <w:rPr>
+                <w:noProof/>
+              </w:rPr>
+              <w:t xml:space="preserve">• NB5 — Autoencoder MLP com calibração de threshold por falhas induzidas (Keras, ~40 K parâmetros). Comparação de três thresholds (Standard P95, Induced P95, Adaptive); a melhor configuração Induced P95 atingiu CARE = 0,545 com Acc por evento normal = 0,98 e Precision amostral = 0,79 — ponto oposto da curva ROC em relação ao NB3, motivando ensemble como linha futura. Notebook: </w:t>
+            </w:r>
+            <w:hyperlink r:id="rId18" w:history="1">
+              <w:r>
+                <w:rPr>
+                  <w:rStyle w:val="Hyperlink"/>
+                  <w:noProof/>
+                </w:rPr>
+                <w:t>wind_turbine_autoencoder_induced_failure.ipynb</w:t>
+              </w:r>
+            </w:hyperlink>
+            <w:r>
+              <w:rPr>
+                <w:noProof/>
+              </w:rPr>
+              <w:t>.</w:t>
             </w:r>
           </w:p>
           <w:p>
@@ -3695,25 +3231,52 @@
               <w:rPr>
                 <w:noProof/>
               </w:rPr>
-              <w:t>Artefatos produzidos: 5 notebooks (.ipynb), 5 scripts (.py), 5 README.md por experimento, métricas padronizadas em metricas.json, modelos treinados (.pth/.keras), thresholds, figuras geradas e analisadas (14 figuras no relatório técnico). Repositório GitHub público: https://github.com/Thiago-Heleno/IC_Thiago-Heleno_Wind_Turbines. Documentos textuais: relatório técnico (relatorio_ic.pdf</w:t>
-            </w:r>
-            <w:r>
-              <w:t>)</w:t>
-            </w:r>
-            <w:r>
-              <w:rPr>
-                <w:noProof/>
-              </w:rPr>
-              <w:t xml:space="preserve"> e slides de apresentação</w:t>
-            </w:r>
-            <w:r>
-              <w:t xml:space="preserve"> </w:t>
-            </w:r>
-            <w:r>
-              <w:rPr>
-                <w:noProof/>
-              </w:rPr>
-              <w:t>(slides/wind_turbine_anomaly_detection_fixed.pptx). Não houve submissão de artigo durante a vigência da bolsa.</w:t>
+              <w:t xml:space="preserve">Artefatos produzidos: 5 notebooks (.ipynb), 5 scripts (.py), 5 README.md por experimento, métricas padronizadas em metricas.json, modelos treinados (.pth/.keras), thresholds, figuras geradas e analisadas (14 figuras no relatório técnico). Repositório GitHub público: </w:t>
+            </w:r>
+            <w:hyperlink r:id="rId19" w:history="1">
+              <w:r>
+                <w:rPr>
+                  <w:rStyle w:val="Hyperlink"/>
+                  <w:noProof/>
+                </w:rPr>
+                <w:t>https://github.com/Thiago-Heleno/IC_Thiago-Heleno_Wind_Turbines</w:t>
+              </w:r>
+            </w:hyperlink>
+            <w:r>
+              <w:rPr>
+                <w:noProof/>
+              </w:rPr>
+              <w:t>. Documentos textuais: relatório técnico (</w:t>
+            </w:r>
+            <w:hyperlink r:id="rId20" w:history="1">
+              <w:r>
+                <w:rPr>
+                  <w:rStyle w:val="Hyperlink"/>
+                  <w:noProof/>
+                </w:rPr>
+                <w:t>relatorio_ic.pdf</w:t>
+              </w:r>
+            </w:hyperlink>
+            <w:r>
+              <w:rPr>
+                <w:noProof/>
+              </w:rPr>
+              <w:t>) e slides de apresentação (</w:t>
+            </w:r>
+            <w:hyperlink r:id="rId21" w:history="1">
+              <w:r>
+                <w:rPr>
+                  <w:rStyle w:val="Hyperlink"/>
+                  <w:noProof/>
+                </w:rPr>
+                <w:t>slides/wind_turbine_anomaly_detection_fixed.pptx</w:t>
+              </w:r>
+            </w:hyperlink>
+            <w:r>
+              <w:rPr>
+                <w:noProof/>
+              </w:rPr>
+              <w:t>). Não houve submissão de artigo durante a vigência da bolsa.</w:t>
             </w:r>
             <w:r>
               <w:rPr>
@@ -3753,6 +3316,7 @@
                 <w:sz w:val="18"/>
                 <w:szCs w:val="18"/>
               </w:rPr>
+              <w:lastRenderedPageBreak/>
               <w:t>4</w:t>
             </w:r>
           </w:p>
@@ -3776,34 +3340,7 @@
                 <w:sz w:val="18"/>
                 <w:szCs w:val="18"/>
               </w:rPr>
-              <w:t xml:space="preserve">Impacto do projeto junto à área acadêmica </w:t>
-            </w:r>
-            <w:r>
-              <w:rPr>
-                <w:rFonts w:ascii="Arial" w:hAnsi="Arial" w:cs="Arial"/>
-                <w:b/>
-                <w:sz w:val="18"/>
-                <w:szCs w:val="18"/>
-              </w:rPr>
-              <w:t>a qual o</w:t>
-            </w:r>
-            <w:r>
-              <w:rPr>
-                <w:rFonts w:ascii="Arial" w:hAnsi="Arial" w:cs="Arial"/>
-                <w:b/>
-                <w:sz w:val="18"/>
-                <w:szCs w:val="18"/>
-              </w:rPr>
-              <w:t>(a)</w:t>
-            </w:r>
-            <w:r>
-              <w:rPr>
-                <w:rFonts w:ascii="Arial" w:hAnsi="Arial" w:cs="Arial"/>
-                <w:b/>
-                <w:sz w:val="18"/>
-                <w:szCs w:val="18"/>
-              </w:rPr>
-              <w:t xml:space="preserve"> bolsista está engajado</w:t>
+              <w:t>Impacto do projeto junto à área acadêmica a qual o(a) bolsista está engajado</w:t>
             </w:r>
           </w:p>
         </w:tc>
@@ -3879,100 +3416,46 @@
               <w:rPr>
                 <w:noProof/>
               </w:rPr>
-              <w:t xml:space="preserve">(i) </w:t>
-            </w:r>
-            <w:r>
-              <w:rPr>
-                <w:noProof/>
-              </w:rPr>
-              <w:t>D</w:t>
-            </w:r>
-            <w:r>
-              <w:rPr>
-                <w:noProof/>
-              </w:rPr>
-              <w:t xml:space="preserve">emonstração quantitativa de que autoencoders não supervisionados superam classificadores supervisionados sob desbalanceamento severo (~51:1) — AUC-ROC 0,87 (NB2) versus 0,66 do melhor supervisionado (NB1 CNN-LSTM); </w:t>
-            </w:r>
-          </w:p>
-          <w:p>
-            <w:pPr>
-              <w:rPr>
-                <w:noProof/>
-              </w:rPr>
-            </w:pPr>
-            <w:r>
-              <w:rPr>
-                <w:noProof/>
-              </w:rPr>
-              <w:t xml:space="preserve">(ii) </w:t>
-            </w:r>
-            <w:r>
-              <w:rPr>
-                <w:noProof/>
-              </w:rPr>
-              <w:t>D</w:t>
-            </w:r>
-            <w:r>
-              <w:rPr>
-                <w:noProof/>
-              </w:rPr>
-              <w:t>ocumentação explícita de uma limitação metodológica raramente discutida na literatura de SCADA público</w:t>
-            </w:r>
-            <w:r>
-              <w:rPr>
-                <w:noProof/>
-              </w:rPr>
-              <w:t xml:space="preserve">, </w:t>
-            </w:r>
-            <w:r>
-              <w:rPr>
-                <w:noProof/>
-              </w:rPr>
-              <w:t xml:space="preserve">a anonimização de coordenadas e datas absolutas inviabiliza por completo a integração com bases meteorológicas externas, obrigando readequação de planos de pesquisa que dependam de dados exógenos; </w:t>
-            </w:r>
-          </w:p>
-          <w:p>
-            <w:pPr>
-              <w:rPr>
-                <w:noProof/>
-              </w:rPr>
-            </w:pPr>
-            <w:r>
-              <w:rPr>
-                <w:noProof/>
-              </w:rPr>
-              <w:t xml:space="preserve">(iii) </w:t>
-            </w:r>
-            <w:r>
-              <w:t>A</w:t>
-            </w:r>
-            <w:r>
-              <w:rPr>
-                <w:noProof/>
-              </w:rPr>
-              <w:t xml:space="preserve">doção do framework CARE Score (Composite Anomaly Reliability Evaluation) e da análise ARCANA (importância de features) do repositório EnergyFaultDetector como métricas padronizadas, permitindo comparação direta com a literatura operacional; </w:t>
-            </w:r>
-          </w:p>
-          <w:p>
-            <w:pPr>
-              <w:rPr>
-                <w:noProof/>
-              </w:rPr>
-            </w:pPr>
-            <w:r>
-              <w:rPr>
-                <w:noProof/>
-              </w:rPr>
-              <w:t xml:space="preserve">(iv) </w:t>
-            </w:r>
-            <w:r>
-              <w:t>C</w:t>
-            </w:r>
-            <w:r>
-              <w:rPr>
-                <w:noProof/>
-              </w:rPr>
-              <w:t xml:space="preserve">aracterização do colapso operacional de classificadores que apresentam F1 amostral elevado mas falham em especificidade por evento normal (caso NB4); </w:t>
+              <w:t xml:space="preserve">(i) Demonstração quantitativa de que autoencoders não supervisionados superam classificadores supervisionados sob desbalanceamento severo (~51:1) — AUC-ROC 0,87 (NB2) versus 0,66 do melhor supervisionado (NB1 CNN-LSTM); </w:t>
+            </w:r>
+          </w:p>
+          <w:p>
+            <w:pPr>
+              <w:rPr>
+                <w:noProof/>
+              </w:rPr>
+            </w:pPr>
+            <w:r>
+              <w:rPr>
+                <w:noProof/>
+              </w:rPr>
+              <w:t xml:space="preserve">(ii) Documentação explícita de uma limitação metodológica raramente discutida na literatura de SCADA público, a anonimização de coordenadas e datas absolutas inviabiliza por completo a integração com bases meteorológicas externas, obrigando readequação de planos de pesquisa que dependam de dados exógenos; </w:t>
+            </w:r>
+          </w:p>
+          <w:p>
+            <w:pPr>
+              <w:rPr>
+                <w:noProof/>
+              </w:rPr>
+            </w:pPr>
+            <w:r>
+              <w:rPr>
+                <w:noProof/>
+              </w:rPr>
+              <w:t xml:space="preserve">(iii) Adoção do framework CARE Score (Composite Anomaly Reliability Evaluation) e da análise ARCANA (importância de features) do repositório EnergyFaultDetector como métricas padronizadas, permitindo comparação direta com a literatura operacional; </w:t>
+            </w:r>
+          </w:p>
+          <w:p>
+            <w:pPr>
+              <w:rPr>
+                <w:noProof/>
+              </w:rPr>
+            </w:pPr>
+            <w:r>
+              <w:rPr>
+                <w:noProof/>
+              </w:rPr>
+              <w:t xml:space="preserve">(iv) Caracterização do colapso operacional de classificadores que apresentam F1 amostral elevado mas falham em especificidade por evento normal (caso NB4); </w:t>
             </w:r>
           </w:p>
           <w:p>
@@ -3986,38 +3469,7 @@
               <w:rPr>
                 <w:noProof/>
               </w:rPr>
-              <w:t xml:space="preserve">(v) </w:t>
-            </w:r>
-            <w:r>
-              <w:t>C</w:t>
-            </w:r>
-            <w:r>
-              <w:rPr>
-                <w:noProof/>
-              </w:rPr>
-              <w:t xml:space="preserve">apacitação técnica do bolsista em pipelines de produção (PyTorch e Keras), otimização automática de hiperparâmetros (Optuna), controle de leakage em pré-processamento, métricas de </w:t>
-            </w:r>
-            <w:r>
-              <w:rPr>
-                <w:noProof/>
-              </w:rPr>
-              <w:lastRenderedPageBreak/>
-              <w:t>classificação para dados desbalanceados e documentação reprodutível de experimentos. As disciplinas cursadas durante a vigência (2025.2 e 2026.1, Tabela 12 do relatório técnico) consolidaram a base em arquitetura de computadores, análise de sinais, circuitos elétricos, projeto e análise de algoritmos e linguagens formais</w:t>
-            </w:r>
-            <w:r>
-              <w:rPr>
-                <w:noProof/>
-              </w:rPr>
-              <w:t xml:space="preserve"> e automatos</w:t>
-            </w:r>
-            <w:r>
-              <w:t xml:space="preserve">, </w:t>
-            </w:r>
-            <w:r>
-              <w:rPr>
-                <w:noProof/>
-              </w:rPr>
-              <w:t>diretamente complementares ao tratamento de séries temporais SCADA e à execução em hardware especializado (GPU NVIDIA RTX A6000).</w:t>
+              <w:t>(v) Capacitação técnica do bolsista em pipelines de produção (PyTorch e Keras), otimização automática de hiperparâmetros (Optuna), controle de leakage em pré-processamento, métricas de classificação para dados desbalanceados e documentação reprodutível de experimentos. As disciplinas cursadas durante a vigência (2025.2 e 2026.1, Tabela 12 do relatório técnico) consolidaram a base em arquitetura de computadores, análise de sinais, circuitos elétricos, projeto e análise de algoritmos e linguagens formais e automatos, diretamente complementares ao tratamento de séries temporais SCADA e à execução em hardware especializado (GPU NVIDIA RTX A6000).</w:t>
             </w:r>
             <w:r>
               <w:rPr>
@@ -4059,7 +3511,6 @@
                 <w:sz w:val="18"/>
                 <w:szCs w:val="18"/>
               </w:rPr>
-              <w:lastRenderedPageBreak/>
               <w:t>5</w:t>
             </w:r>
           </w:p>
@@ -4103,16 +3554,7 @@
                 <w:sz w:val="16"/>
                 <w:szCs w:val="16"/>
               </w:rPr>
-              <w:t>(preencher este campo somente se  tratar de Relatório</w:t>
-            </w:r>
-            <w:r>
-              <w:rPr>
-                <w:rFonts w:ascii="Arial" w:hAnsi="Arial" w:cs="Arial"/>
-                <w:i/>
-                <w:sz w:val="16"/>
-                <w:szCs w:val="16"/>
-              </w:rPr>
-              <w:t xml:space="preserve"> Parcial)</w:t>
+              <w:t>(preencher este campo somente se  tratar de Relatório Parcial)</w:t>
             </w:r>
           </w:p>
         </w:tc>
@@ -4200,51 +3642,7 @@
                 <w:sz w:val="18"/>
                 <w:szCs w:val="18"/>
               </w:rPr>
-              <w:t> </w:t>
-            </w:r>
-            <w:r>
-              <w:rPr>
-                <w:rFonts w:ascii="Arial" w:hAnsi="Arial" w:cs="Arial"/>
-                <w:b/>
-                <w:i/>
-                <w:noProof/>
-                <w:sz w:val="18"/>
-                <w:szCs w:val="18"/>
-              </w:rPr>
-              <w:t> </w:t>
-            </w:r>
-            <w:r>
-              <w:rPr>
-                <w:rFonts w:ascii="Arial" w:hAnsi="Arial" w:cs="Arial"/>
-                <w:b/>
-                <w:i/>
-                <w:noProof/>
-                <w:sz w:val="18"/>
-                <w:szCs w:val="18"/>
-              </w:rPr>
-              <w:t> </w:t>
-            </w:r>
-            <w:r>
-              <w:rPr>
-                <w:rFonts w:ascii="Arial" w:hAnsi="Arial" w:cs="Arial"/>
-                <w:b/>
-                <w:i/>
-                <w:noProof/>
-                <w:sz w:val="18"/>
-                <w:szCs w:val="18"/>
-              </w:rPr>
-              <w:t> </w:t>
-            </w:r>
-            <w:r>
-              <w:rPr>
-                <w:rFonts w:ascii="Arial" w:hAnsi="Arial" w:cs="Arial"/>
-                <w:b/>
-                <w:i/>
-                <w:noProof/>
-                <w:sz w:val="18"/>
-                <w:szCs w:val="18"/>
-              </w:rPr>
-              <w:t> </w:t>
+              <w:t>     </w:t>
             </w:r>
             <w:r>
               <w:rPr>
@@ -4344,34 +3742,7 @@
                 <w:sz w:val="18"/>
                 <w:szCs w:val="18"/>
               </w:rPr>
-              <w:t>Relacionar os documentos que fundamenta</w:t>
-            </w:r>
-            <w:r>
-              <w:rPr>
-                <w:rFonts w:ascii="Arial" w:hAnsi="Arial" w:cs="Arial"/>
-                <w:b/>
-                <w:sz w:val="18"/>
-                <w:szCs w:val="18"/>
-              </w:rPr>
-              <w:t>m</w:t>
-            </w:r>
-            <w:r>
-              <w:rPr>
-                <w:rFonts w:ascii="Arial" w:hAnsi="Arial" w:cs="Arial"/>
-                <w:b/>
-                <w:sz w:val="18"/>
-                <w:szCs w:val="18"/>
-              </w:rPr>
-              <w:t xml:space="preserve"> a pesquisa realizada</w:t>
-            </w:r>
-            <w:r>
-              <w:rPr>
-                <w:rFonts w:ascii="Arial" w:hAnsi="Arial" w:cs="Arial"/>
-                <w:b/>
-                <w:sz w:val="18"/>
-                <w:szCs w:val="18"/>
-              </w:rPr>
-              <w:t xml:space="preserve"> e anexá-los a este relatório </w:t>
+              <w:t xml:space="preserve">Relacionar os documentos que fundamentam a pesquisa realizada e anexá-los a este relatório </w:t>
             </w:r>
             <w:r>
               <w:rPr>
@@ -4456,104 +3827,128 @@
               <w:rPr>
                 <w:noProof/>
               </w:rPr>
-              <w:t>(</w:t>
-            </w:r>
-            <w:r>
-              <w:t>i</w:t>
-            </w:r>
-            <w:r>
-              <w:rPr>
-                <w:noProof/>
-              </w:rPr>
-              <w:t>) Relatório Técnico Final — relatorio_ic.pdf (fundamentação teórica, metodologia, experimentos, problemas com dados, resultados, limitações e atribuições, cronograma realizado e disciplinas cursadas).</w:t>
-            </w:r>
-          </w:p>
-          <w:p>
-            <w:pPr>
-              <w:rPr>
-                <w:noProof/>
-              </w:rPr>
-            </w:pPr>
-            <w:r>
-              <w:rPr>
-                <w:noProof/>
-              </w:rPr>
-              <w:t>(</w:t>
-            </w:r>
-            <w:r>
-              <w:t>ii</w:t>
-            </w:r>
-            <w:r>
-              <w:rPr>
-                <w:noProof/>
-              </w:rPr>
-              <w:t>) Cinco notebooks Jupyter executados em notebooks/ (versões .ipynb e .py espelhadas).</w:t>
-            </w:r>
-          </w:p>
-          <w:p>
-            <w:pPr>
-              <w:rPr>
-                <w:noProof/>
-              </w:rPr>
-            </w:pPr>
-            <w:r>
-              <w:rPr>
-                <w:noProof/>
-              </w:rPr>
-              <w:t>(</w:t>
-            </w:r>
-            <w:r>
-              <w:t>iii</w:t>
-            </w:r>
-            <w:r>
-              <w:rPr>
-                <w:noProof/>
-              </w:rPr>
-              <w:t>) Artefatos por experimento em resultados/01–05 (modelos treinados, thresholds calibrados, métricas em metricas.json, README.md por subdiretório, métricas consolidadas em resultados/metricas_consolidadas.csv).</w:t>
-            </w:r>
-          </w:p>
-          <w:p>
-            <w:pPr>
-              <w:rPr>
-                <w:noProof/>
-              </w:rPr>
-            </w:pPr>
-            <w:r>
-              <w:rPr>
-                <w:noProof/>
-              </w:rPr>
-              <w:t>(</w:t>
-            </w:r>
-            <w:r>
-              <w:t>iv</w:t>
-            </w:r>
-            <w:r>
-              <w:rPr>
-                <w:noProof/>
-              </w:rPr>
-              <w:t>) Bibliografia consolidada em referencias.bib</w:t>
-            </w:r>
-          </w:p>
-          <w:p>
-            <w:pPr>
-              <w:rPr>
-                <w:noProof/>
-              </w:rPr>
-            </w:pPr>
-            <w:r>
-              <w:rPr>
-                <w:noProof/>
-              </w:rPr>
-              <w:t>(</w:t>
-            </w:r>
-            <w:r>
-              <w:t>v</w:t>
-            </w:r>
-            <w:r>
-              <w:rPr>
-                <w:noProof/>
-              </w:rPr>
-              <w:t>) Slides de apresentação em slides/wind_turbine_anomaly_detectio.pptx.</w:t>
+              <w:t xml:space="preserve">(i) Relatório Técnico Final — </w:t>
+            </w:r>
+            <w:hyperlink r:id="rId22" w:history="1">
+              <w:r>
+                <w:rPr>
+                  <w:rStyle w:val="Hyperlink"/>
+                  <w:noProof/>
+                </w:rPr>
+                <w:t>relatorio_ic.pdf</w:t>
+              </w:r>
+            </w:hyperlink>
+            <w:r>
+              <w:rPr>
+                <w:noProof/>
+              </w:rPr>
+              <w:t xml:space="preserve"> (fundamentação teórica, metodologia, experimentos, problemas com dados, resultados, limitações e atribuições, cronograma realizado e disciplinas cursadas).</w:t>
+            </w:r>
+          </w:p>
+          <w:p>
+            <w:pPr>
+              <w:rPr>
+                <w:noProof/>
+              </w:rPr>
+            </w:pPr>
+            <w:r>
+              <w:rPr>
+                <w:noProof/>
+              </w:rPr>
+              <w:t xml:space="preserve">(ii) Cinco notebooks Jupyter executados em </w:t>
+            </w:r>
+            <w:hyperlink r:id="rId23" w:history="1">
+              <w:r>
+                <w:rPr>
+                  <w:rStyle w:val="Hyperlink"/>
+                  <w:noProof/>
+                </w:rPr>
+                <w:t>notebooks/</w:t>
+              </w:r>
+            </w:hyperlink>
+            <w:r>
+              <w:rPr>
+                <w:noProof/>
+              </w:rPr>
+              <w:t xml:space="preserve"> (versões .ipynb e .py espelhadas).</w:t>
+            </w:r>
+          </w:p>
+          <w:p>
+            <w:pPr>
+              <w:rPr>
+                <w:noProof/>
+              </w:rPr>
+            </w:pPr>
+            <w:r>
+              <w:rPr>
+                <w:noProof/>
+              </w:rPr>
+              <w:t xml:space="preserve">(iii) Artefatos por experimento em </w:t>
+            </w:r>
+            <w:hyperlink r:id="rId24" w:history="1">
+              <w:r>
+                <w:rPr>
+                  <w:rStyle w:val="Hyperlink"/>
+                  <w:noProof/>
+                </w:rPr>
+                <w:t>resultados/01–05</w:t>
+              </w:r>
+            </w:hyperlink>
+            <w:r>
+              <w:rPr>
+                <w:noProof/>
+              </w:rPr>
+              <w:t xml:space="preserve"> (modelos treinados, thresholds calibrados, métricas em metricas.json, README.md por subdiretório, métricas consolidadas em resultados/metricas_consolidadas.csv).</w:t>
+            </w:r>
+          </w:p>
+          <w:p>
+            <w:pPr>
+              <w:rPr>
+                <w:noProof/>
+              </w:rPr>
+            </w:pPr>
+            <w:r>
+              <w:rPr>
+                <w:noProof/>
+              </w:rPr>
+              <w:t xml:space="preserve">(iv) Bibliografia consolidada em </w:t>
+            </w:r>
+            <w:hyperlink r:id="rId25" w:history="1">
+              <w:r>
+                <w:rPr>
+                  <w:rStyle w:val="Hyperlink"/>
+                  <w:noProof/>
+                </w:rPr>
+                <w:t>referencias.bib</w:t>
+              </w:r>
+            </w:hyperlink>
+          </w:p>
+          <w:p>
+            <w:pPr>
+              <w:rPr>
+                <w:noProof/>
+              </w:rPr>
+            </w:pPr>
+            <w:r>
+              <w:rPr>
+                <w:noProof/>
+              </w:rPr>
+              <w:t xml:space="preserve">(v) Slides de apresentação em </w:t>
+            </w:r>
+            <w:hyperlink r:id="rId26" w:history="1">
+              <w:r>
+                <w:rPr>
+                  <w:rStyle w:val="Hyperlink"/>
+                  <w:noProof/>
+                </w:rPr>
+                <w:t>slides/wind_turbine_anomaly_detection_fixed.pptx</w:t>
+              </w:r>
+            </w:hyperlink>
+            <w:r>
+              <w:rPr>
+                <w:noProof/>
+              </w:rPr>
+              <w:t>.</w:t>
             </w:r>
           </w:p>
           <w:p>
@@ -4567,16 +3962,23 @@
               <w:rPr>
                 <w:noProof/>
               </w:rPr>
-              <w:t>(</w:t>
-            </w:r>
-            <w:r>
-              <w:t>vi</w:t>
-            </w:r>
-            <w:r>
-              <w:rPr>
-                <w:noProof/>
-              </w:rPr>
-              <w:t>) Repositório público com código, documentação e instruções de reprodução: https://github.com/Thiago-Heleno/IC_Thiago-Heleno_Wind_Turbines.</w:t>
+              <w:t xml:space="preserve">(vi) Repositório público com código, documentação e instruções de reprodução: </w:t>
+            </w:r>
+            <w:hyperlink r:id="rId27" w:history="1">
+              <w:r>
+                <w:rPr>
+                  <w:rStyle w:val="Hyperlink"/>
+                  <w:b/>
+                  <w:noProof/>
+                </w:rPr>
+                <w:t>https://github.com/Thiago-Heleno/IC_Thiago-Heleno_Wind_Turbines</w:t>
+              </w:r>
+            </w:hyperlink>
+            <w:r>
+              <w:rPr>
+                <w:noProof/>
+              </w:rPr>
+              <w:t>.</w:t>
             </w:r>
             <w:r>
               <w:rPr>
@@ -4706,75 +4108,33 @@
               <w:rPr>
                 <w:noProof/>
               </w:rPr>
-              <w:t xml:space="preserve">(i) </w:t>
-            </w:r>
-            <w:r>
-              <w:rPr>
-                <w:noProof/>
-              </w:rPr>
-              <w:t>O</w:t>
-            </w:r>
-            <w:r>
-              <w:rPr>
-                <w:noProof/>
-              </w:rPr>
-              <w:t xml:space="preserve"> título do projeto manteve a referência a "Dados Exógenos" do plano original, embora o trabalho tenha sido readequado para comparação entre paradigmas (supervisionado vs. não supervisionado) e exploração de falhas sintéticas</w:t>
-            </w:r>
-          </w:p>
-          <w:p>
-            <w:pPr>
-              <w:rPr>
-                <w:noProof/>
-              </w:rPr>
-            </w:pPr>
-            <w:r>
-              <w:rPr>
-                <w:noProof/>
-              </w:rPr>
-              <w:t xml:space="preserve">(ii) </w:t>
-            </w:r>
-            <w:r>
-              <w:rPr>
-                <w:noProof/>
-              </w:rPr>
-              <w:t>O</w:t>
-            </w:r>
-            <w:r>
-              <w:rPr>
-                <w:noProof/>
-              </w:rPr>
-              <w:t>s experimentos finais foram conduzidos em workstation com GPU NVIDIA RTX A6000</w:t>
-            </w:r>
-            <w:r>
-              <w:rPr>
-                <w:noProof/>
-              </w:rPr>
-              <w:t>;</w:t>
-            </w:r>
-          </w:p>
-          <w:p>
-            <w:pPr>
-              <w:rPr>
-                <w:noProof/>
-              </w:rPr>
-            </w:pPr>
-            <w:r>
-              <w:rPr>
-                <w:noProof/>
-              </w:rPr>
-              <w:t xml:space="preserve">(iii) </w:t>
-            </w:r>
-            <w:r>
-              <w:rPr>
-                <w:noProof/>
-              </w:rPr>
-              <w:t>T</w:t>
-            </w:r>
-            <w:r>
-              <w:rPr>
-                <w:noProof/>
-              </w:rPr>
-              <w:t xml:space="preserve">oda a pesquisa foi documentada de forma reprodutível, com sementes fixadas (seed=42) e ambiente especificado em notebooks/requirements.txt; </w:t>
+              <w:t>(i) O título do projeto manteve a referência a "Dados Exógenos" do plano original, embora o trabalho tenha sido readequado para comparação entre paradigmas (supervisionado vs. não supervisionado) e exploração de falhas sintéticas</w:t>
+            </w:r>
+          </w:p>
+          <w:p>
+            <w:pPr>
+              <w:rPr>
+                <w:noProof/>
+              </w:rPr>
+            </w:pPr>
+            <w:r>
+              <w:rPr>
+                <w:noProof/>
+              </w:rPr>
+              <w:t>(ii) Os experimentos finais foram conduzidos em workstation com GPU NVIDIA RTX A6000;</w:t>
+            </w:r>
+          </w:p>
+          <w:p>
+            <w:pPr>
+              <w:rPr>
+                <w:noProof/>
+              </w:rPr>
+            </w:pPr>
+            <w:r>
+              <w:rPr>
+                <w:noProof/>
+              </w:rPr>
+              <w:t xml:space="preserve">(iii) Toda a pesquisa foi documentada de forma reprodutível, com sementes fixadas (seed=42) e ambiente especificado em notebooks/requirements.txt; </w:t>
             </w:r>
           </w:p>
           <w:p>
@@ -4788,25 +4148,7 @@
               <w:rPr>
                 <w:noProof/>
               </w:rPr>
-              <w:t xml:space="preserve">(iv) </w:t>
-            </w:r>
-            <w:r>
-              <w:rPr>
-                <w:noProof/>
-              </w:rPr>
-              <w:t>C</w:t>
-            </w:r>
-            <w:r>
-              <w:rPr>
-                <w:noProof/>
-              </w:rPr>
-              <w:t>omponentes replicados de fontes externas (CARE Score, ARCANA e arquitetura CNN-LSTM do NB1) estão explicitamente atribuídos na Seção 11.2 do relatório técnico</w:t>
-            </w:r>
-            <w:r>
-              <w:rPr>
-                <w:noProof/>
-              </w:rPr>
-              <w:t>;</w:t>
+              <w:t>(iv) Componentes replicados de fontes externas (CARE Score, ARCANA e arquitetura CNN-LSTM do NB1) estão explicitamente atribuídos na Seção 11.2 do relatório técnico;</w:t>
             </w:r>
             <w:r>
               <w:rPr>
@@ -4908,23 +4250,7 @@
                 <w:sz w:val="14"/>
                 <w:szCs w:val="14"/>
               </w:rPr>
-              <w:t>Assinatura do</w:t>
-            </w:r>
-            <w:r>
-              <w:rPr>
-                <w:rFonts w:ascii="Arial" w:hAnsi="Arial" w:cs="Arial"/>
-                <w:sz w:val="14"/>
-                <w:szCs w:val="14"/>
-              </w:rPr>
-              <w:t>(a)</w:t>
-            </w:r>
-            <w:r>
-              <w:rPr>
-                <w:rFonts w:ascii="Arial" w:hAnsi="Arial" w:cs="Arial"/>
-                <w:sz w:val="14"/>
-                <w:szCs w:val="14"/>
-              </w:rPr>
-              <w:t xml:space="preserve"> Bolsista </w:t>
+              <w:t xml:space="preserve">Assinatura do(a) Bolsista </w:t>
             </w:r>
           </w:p>
         </w:tc>
@@ -4950,31 +4276,7 @@
                 <w:sz w:val="14"/>
                 <w:szCs w:val="14"/>
               </w:rPr>
-              <w:t>Assinatura do</w:t>
-            </w:r>
-            <w:r>
-              <w:rPr>
-                <w:rFonts w:ascii="Arial" w:hAnsi="Arial" w:cs="Arial"/>
-                <w:sz w:val="14"/>
-                <w:szCs w:val="14"/>
-              </w:rPr>
-              <w:t>(a)</w:t>
-            </w:r>
-            <w:r>
-              <w:rPr>
-                <w:rFonts w:ascii="Arial" w:hAnsi="Arial" w:cs="Arial"/>
-                <w:sz w:val="14"/>
-                <w:szCs w:val="14"/>
-              </w:rPr>
-              <w:t xml:space="preserve"> Orientador</w:t>
-            </w:r>
-            <w:r>
-              <w:rPr>
-                <w:rFonts w:ascii="Arial" w:hAnsi="Arial" w:cs="Arial"/>
-                <w:sz w:val="14"/>
-                <w:szCs w:val="14"/>
-              </w:rPr>
-              <w:t>(a)</w:t>
+              <w:t>Assinatura do(a) Orientador(a)</w:t>
             </w:r>
           </w:p>
         </w:tc>
@@ -5000,23 +4302,7 @@
                 <w:sz w:val="14"/>
                 <w:szCs w:val="14"/>
               </w:rPr>
-              <w:t>Assinatura do</w:t>
-            </w:r>
-            <w:r>
-              <w:rPr>
-                <w:rFonts w:ascii="Arial" w:hAnsi="Arial" w:cs="Arial"/>
-                <w:sz w:val="14"/>
-                <w:szCs w:val="14"/>
-              </w:rPr>
-              <w:t xml:space="preserve"> Coordenador</w:t>
-            </w:r>
-            <w:r>
-              <w:rPr>
-                <w:rFonts w:ascii="Arial" w:hAnsi="Arial" w:cs="Arial"/>
-                <w:sz w:val="14"/>
-                <w:szCs w:val="14"/>
-              </w:rPr>
-              <w:t>(a)</w:t>
+              <w:t>Assinatura do Coordenador(a)</w:t>
             </w:r>
           </w:p>
         </w:tc>
@@ -5028,7 +4314,7 @@
       </w:pPr>
     </w:p>
     <w:sectPr>
-      <w:footerReference w:type="default" r:id="rId9"/>
+      <w:footerReference w:type="default" r:id="rId28"/>
       <w:pgSz w:w="11907" w:h="16840" w:code="9"/>
       <w:pgMar w:top="357" w:right="851" w:bottom="295" w:left="1701" w:header="164" w:footer="391" w:gutter="0"/>
       <w:cols w:space="708"/>

</xml_diff>